<commit_message>
Add Decision-PersistenceTableApproach doc and update Prompt
Decicion-PersistenceTableApproach.docx:
  Decision document for PO Notes New Persistency table approach
  covering options analysis from CE2702/CE2708 sync-up

Prompt.docx: updated
</commit_message>
<xml_diff>
--- a/Prompt.docx
+++ b/Prompt.docx
@@ -204,6 +204,89 @@
         <w:t xml:space="preserve"> files you created</w:t>
       </w:r>
     </w:p>
+    <w:p/>
+    <w:p>
+      <w:r>
+        <w:drawing>
+          <wp:inline distT="0" distB="0" distL="0" distR="0" wp14:anchorId="4F136D8B" wp14:editId="23F6ECD4">
+            <wp:extent cx="6115050" cy="3138170"/>
+            <wp:effectExtent l="0" t="0" r="0" b="5080"/>
+            <wp:docPr id="1236333213" name="Picture 1"/>
+            <wp:cNvGraphicFramePr>
+              <a:graphicFrameLocks xmlns:a="http://schemas.openxmlformats.org/drawingml/2006/main" noChangeAspect="1"/>
+            </wp:cNvGraphicFramePr>
+            <a:graphic xmlns:a="http://schemas.openxmlformats.org/drawingml/2006/main">
+              <a:graphicData uri="http://schemas.openxmlformats.org/drawingml/2006/picture">
+                <pic:pic xmlns:pic="http://schemas.openxmlformats.org/drawingml/2006/picture">
+                  <pic:nvPicPr>
+                    <pic:cNvPr id="1236333213" name=""/>
+                    <pic:cNvPicPr/>
+                  </pic:nvPicPr>
+                  <pic:blipFill>
+                    <a:blip r:embed="rId11"/>
+                    <a:stretch>
+                      <a:fillRect/>
+                    </a:stretch>
+                  </pic:blipFill>
+                  <pic:spPr>
+                    <a:xfrm>
+                      <a:off x="0" y="0"/>
+                      <a:ext cx="6115050" cy="3138170"/>
+                    </a:xfrm>
+                    <a:prstGeom prst="rect">
+                      <a:avLst/>
+                    </a:prstGeom>
+                  </pic:spPr>
+                </pic:pic>
+              </a:graphicData>
+            </a:graphic>
+          </wp:inline>
+        </w:drawing>
+      </w:r>
+    </w:p>
+    <w:p/>
+    <w:p/>
+    <w:p>
+      <w:r>
+        <w:lastRenderedPageBreak/>
+        <w:drawing>
+          <wp:inline distT="0" distB="0" distL="0" distR="0" wp14:anchorId="3C17CC73" wp14:editId="0C734EFF">
+            <wp:extent cx="6115050" cy="3165475"/>
+            <wp:effectExtent l="0" t="0" r="0" b="0"/>
+            <wp:docPr id="295419385" name="Picture 1"/>
+            <wp:cNvGraphicFramePr>
+              <a:graphicFrameLocks xmlns:a="http://schemas.openxmlformats.org/drawingml/2006/main" noChangeAspect="1"/>
+            </wp:cNvGraphicFramePr>
+            <a:graphic xmlns:a="http://schemas.openxmlformats.org/drawingml/2006/main">
+              <a:graphicData uri="http://schemas.openxmlformats.org/drawingml/2006/picture">
+                <pic:pic xmlns:pic="http://schemas.openxmlformats.org/drawingml/2006/picture">
+                  <pic:nvPicPr>
+                    <pic:cNvPr id="295419385" name=""/>
+                    <pic:cNvPicPr/>
+                  </pic:nvPicPr>
+                  <pic:blipFill>
+                    <a:blip r:embed="rId12"/>
+                    <a:stretch>
+                      <a:fillRect/>
+                    </a:stretch>
+                  </pic:blipFill>
+                  <pic:spPr>
+                    <a:xfrm>
+                      <a:off x="0" y="0"/>
+                      <a:ext cx="6115050" cy="3165475"/>
+                    </a:xfrm>
+                    <a:prstGeom prst="rect">
+                      <a:avLst/>
+                    </a:prstGeom>
+                  </pic:spPr>
+                </pic:pic>
+              </a:graphicData>
+            </a:graphic>
+          </wp:inline>
+        </w:drawing>
+      </w:r>
+    </w:p>
+    <w:p/>
     <w:p/>
     <w:p>
       <w:pPr>

</xml_diff>